<commit_message>
plan contingencia, acta5, insp_ext1
</commit_message>
<xml_diff>
--- a/Inputs/Templates/MF Gasera.docx
+++ b/Inputs/Templates/MF Gasera.docx
@@ -907,6 +907,7 @@
           <w:rFonts w:cstheme="minorHAnsi"/>
           <w:color w:val="000000" w:themeColor="text1"/>
         </w:rPr>
+        <w:lastRenderedPageBreak/>
         <w:br w:type="page"/>
       </w:r>
     </w:p>
@@ -2778,6 +2779,324 @@
     </w:pPr>
     <w:r>
       <w:rPr>
+        <w:noProof/>
+        <w:lang w:eastAsia="es-MX"/>
+      </w:rPr>
+      <w:drawing>
+        <wp:anchor distT="0" distB="0" distL="114300" distR="114300" simplePos="0" relativeHeight="251662336" behindDoc="1" locked="0" layoutInCell="1" allowOverlap="1" wp14:anchorId="1BCD9976" wp14:editId="7915F01D">
+          <wp:simplePos x="0" y="0"/>
+          <wp:positionH relativeFrom="margin">
+            <wp:posOffset>-1089660</wp:posOffset>
+          </wp:positionH>
+          <wp:positionV relativeFrom="paragraph">
+            <wp:posOffset>220345</wp:posOffset>
+          </wp:positionV>
+          <wp:extent cx="7781925" cy="914400"/>
+          <wp:effectExtent l="0" t="0" r="9525" b="0"/>
+          <wp:wrapNone/>
+          <wp:docPr id="758821939" name="Imagen 758821939" descr="H:\GRUPO MILANO\FRANJA-03-03.png"/>
+          <wp:cNvGraphicFramePr>
+            <a:graphicFrameLocks xmlns:a="http://schemas.openxmlformats.org/drawingml/2006/main" noChangeAspect="1"/>
+          </wp:cNvGraphicFramePr>
+          <a:graphic xmlns:a="http://schemas.openxmlformats.org/drawingml/2006/main">
+            <a:graphicData uri="http://schemas.openxmlformats.org/drawingml/2006/picture">
+              <pic:pic xmlns:pic="http://schemas.openxmlformats.org/drawingml/2006/picture">
+                <pic:nvPicPr>
+                  <pic:cNvPr id="0" name="Picture 3" descr="H:\GRUPO MILANO\FRANJA-03-03.png"/>
+                  <pic:cNvPicPr>
+                    <a:picLocks noChangeAspect="1" noChangeArrowheads="1"/>
+                  </pic:cNvPicPr>
+                </pic:nvPicPr>
+                <pic:blipFill rotWithShape="1">
+                  <a:blip r:embed="rId1" cstate="print">
+                    <a:extLst>
+                      <a:ext uri="{28A0092B-C50C-407E-A947-70E740481C1C}">
+                        <a14:useLocalDpi xmlns:a14="http://schemas.microsoft.com/office/drawing/2010/main" val="0"/>
+                      </a:ext>
+                    </a:extLst>
+                  </a:blip>
+                  <a:srcRect t="87861"/>
+                  <a:stretch/>
+                </pic:blipFill>
+                <pic:spPr bwMode="auto">
+                  <a:xfrm>
+                    <a:off x="0" y="0"/>
+                    <a:ext cx="7781925" cy="914400"/>
+                  </a:xfrm>
+                  <a:prstGeom prst="rect">
+                    <a:avLst/>
+                  </a:prstGeom>
+                  <a:noFill/>
+                  <a:ln>
+                    <a:noFill/>
+                  </a:ln>
+                  <a:extLst>
+                    <a:ext uri="{53640926-AAD7-44D8-BBD7-CCE9431645EC}">
+                      <a14:shadowObscured xmlns:a14="http://schemas.microsoft.com/office/drawing/2010/main"/>
+                    </a:ext>
+                  </a:extLst>
+                </pic:spPr>
+              </pic:pic>
+            </a:graphicData>
+          </a:graphic>
+          <wp14:sizeRelH relativeFrom="page">
+            <wp14:pctWidth>0</wp14:pctWidth>
+          </wp14:sizeRelH>
+          <wp14:sizeRelV relativeFrom="page">
+            <wp14:pctHeight>0</wp14:pctHeight>
+          </wp14:sizeRelV>
+        </wp:anchor>
+      </w:drawing>
+    </w:r>
+    <w:r>
+      <w:rPr>
+        <w:rFonts w:ascii="Calibri" w:eastAsia="Times New Roman" w:hAnsi="Calibri" w:cs="Times New Roman"/>
+        <w:noProof/>
+        <w:lang w:eastAsia="es-MX"/>
+      </w:rPr>
+      <w:drawing>
+        <wp:anchor distT="0" distB="0" distL="114300" distR="114300" simplePos="0" relativeHeight="251663360" behindDoc="1" locked="0" layoutInCell="1" allowOverlap="1" wp14:anchorId="3F42436C" wp14:editId="3B7C9990">
+          <wp:simplePos x="0" y="0"/>
+          <wp:positionH relativeFrom="margin">
+            <wp:posOffset>4715510</wp:posOffset>
+          </wp:positionH>
+          <wp:positionV relativeFrom="paragraph">
+            <wp:posOffset>118745</wp:posOffset>
+          </wp:positionV>
+          <wp:extent cx="684530" cy="431800"/>
+          <wp:effectExtent l="0" t="0" r="1270" b="6350"/>
+          <wp:wrapNone/>
+          <wp:docPr id="556005827" name="Imagen 556005827" descr="Logotipo&#10;&#10;Descripción generada automáticamente"/>
+          <wp:cNvGraphicFramePr>
+            <a:graphicFrameLocks xmlns:a="http://schemas.openxmlformats.org/drawingml/2006/main" noChangeAspect="1"/>
+          </wp:cNvGraphicFramePr>
+          <a:graphic xmlns:a="http://schemas.openxmlformats.org/drawingml/2006/main">
+            <a:graphicData uri="http://schemas.openxmlformats.org/drawingml/2006/picture">
+              <pic:pic xmlns:pic="http://schemas.openxmlformats.org/drawingml/2006/picture">
+                <pic:nvPicPr>
+                  <pic:cNvPr id="1099352104" name="Imagen 1099352104" descr="Logotipo&#10;&#10;Descripción generada automáticamente"/>
+                  <pic:cNvPicPr>
+                    <a:picLocks noChangeAspect="1" noChangeArrowheads="1"/>
+                  </pic:cNvPicPr>
+                </pic:nvPicPr>
+                <pic:blipFill>
+                  <a:blip r:embed="rId2">
+                    <a:extLst>
+                      <a:ext uri="{28A0092B-C50C-407E-A947-70E740481C1C}">
+                        <a14:useLocalDpi xmlns:a14="http://schemas.microsoft.com/office/drawing/2010/main" val="0"/>
+                      </a:ext>
+                    </a:extLst>
+                  </a:blip>
+                  <a:srcRect/>
+                  <a:stretch>
+                    <a:fillRect/>
+                  </a:stretch>
+                </pic:blipFill>
+                <pic:spPr bwMode="auto">
+                  <a:xfrm>
+                    <a:off x="0" y="0"/>
+                    <a:ext cx="684530" cy="431800"/>
+                  </a:xfrm>
+                  <a:prstGeom prst="rect">
+                    <a:avLst/>
+                  </a:prstGeom>
+                  <a:noFill/>
+                  <a:ln>
+                    <a:noFill/>
+                  </a:ln>
+                </pic:spPr>
+              </pic:pic>
+            </a:graphicData>
+          </a:graphic>
+          <wp14:sizeRelH relativeFrom="page">
+            <wp14:pctWidth>0</wp14:pctWidth>
+          </wp14:sizeRelH>
+          <wp14:sizeRelV relativeFrom="page">
+            <wp14:pctHeight>0</wp14:pctHeight>
+          </wp14:sizeRelV>
+        </wp:anchor>
+      </w:drawing>
+    </w:r>
+    <w:r>
+      <w:rPr>
+        <w:noProof/>
+        <w:lang w:eastAsia="es-MX"/>
+      </w:rPr>
+      <mc:AlternateContent>
+        <mc:Choice Requires="wps">
+          <w:drawing>
+            <wp:anchor distT="0" distB="0" distL="114300" distR="114300" simplePos="0" relativeHeight="251664384" behindDoc="0" locked="0" layoutInCell="1" allowOverlap="1" wp14:anchorId="57ABE7DB" wp14:editId="40265FBA">
+              <wp:simplePos x="0" y="0"/>
+              <wp:positionH relativeFrom="column">
+                <wp:posOffset>2738755</wp:posOffset>
+              </wp:positionH>
+              <wp:positionV relativeFrom="paragraph">
+                <wp:posOffset>90805</wp:posOffset>
+              </wp:positionV>
+              <wp:extent cx="1965960" cy="487680"/>
+              <wp:effectExtent l="0" t="0" r="0" b="7620"/>
+              <wp:wrapNone/>
+              <wp:docPr id="1448439813" name="Cuadro de texto 4"/>
+              <wp:cNvGraphicFramePr/>
+              <a:graphic xmlns:a="http://schemas.openxmlformats.org/drawingml/2006/main">
+                <a:graphicData uri="http://schemas.microsoft.com/office/word/2010/wordprocessingShape">
+                  <wps:wsp>
+                    <wps:cNvSpPr txBox="1"/>
+                    <wps:spPr>
+                      <a:xfrm>
+                        <a:off x="0" y="0"/>
+                        <a:ext cx="1965960" cy="487680"/>
+                      </a:xfrm>
+                      <a:prstGeom prst="rect">
+                        <a:avLst/>
+                      </a:prstGeom>
+                      <a:noFill/>
+                      <a:ln w="6350">
+                        <a:noFill/>
+                      </a:ln>
+                    </wps:spPr>
+                    <wps:txbx>
+                      <w:txbxContent>
+                        <w:p>
+                          <w:pPr>
+                            <w:spacing w:after="0" w:line="240" w:lineRule="auto"/>
+                            <w:jc w:val="right"/>
+                            <w:rPr>
+                              <w:sz w:val="18"/>
+                              <w:szCs w:val="18"/>
+                            </w:rPr>
+                          </w:pPr>
+                          <w:r>
+                            <w:rPr>
+                              <w:sz w:val="18"/>
+                              <w:szCs w:val="18"/>
+                            </w:rPr>
+                            <w:t>CONSULTOR: NOE MORA RAMIREZ</w:t>
+                          </w:r>
+                        </w:p>
+                        <w:p>
+                          <w:pPr>
+                            <w:spacing w:after="0" w:line="240" w:lineRule="auto"/>
+                            <w:jc w:val="right"/>
+                            <w:rPr>
+                              <w:sz w:val="18"/>
+                              <w:szCs w:val="18"/>
+                            </w:rPr>
+                          </w:pPr>
+                          <w:r>
+                            <w:rPr>
+                              <w:sz w:val="18"/>
+                              <w:szCs w:val="18"/>
+                            </w:rPr>
+                            <w:t>TELEFONO CELULAR: 2454504055</w:t>
+                          </w:r>
+                        </w:p>
+                        <w:p>
+                          <w:pPr>
+                            <w:spacing w:after="0" w:line="240" w:lineRule="auto"/>
+                            <w:jc w:val="right"/>
+                            <w:rPr>
+                              <w:sz w:val="18"/>
+                              <w:szCs w:val="18"/>
+                            </w:rPr>
+                          </w:pPr>
+                          <w:r>
+                            <w:rPr>
+                              <w:sz w:val="18"/>
+                              <w:szCs w:val="18"/>
+                            </w:rPr>
+                            <w:t>CORREO: halcon_noe@yahoo.com.mx</w:t>
+                          </w:r>
+                        </w:p>
+                      </w:txbxContent>
+                    </wps:txbx>
+                    <wps:bodyPr rot="0" spcFirstLastPara="0" vertOverflow="overflow" horzOverflow="overflow" vert="horz" wrap="square" lIns="91440" tIns="45720" rIns="91440" bIns="45720" numCol="1" spcCol="0" rtlCol="0" fromWordArt="0" anchor="t" anchorCtr="0" forceAA="0" compatLnSpc="1">
+                      <a:prstTxWarp prst="textNoShape">
+                        <a:avLst/>
+                      </a:prstTxWarp>
+                      <a:noAutofit/>
+                    </wps:bodyPr>
+                  </wps:wsp>
+                </a:graphicData>
+              </a:graphic>
+              <wp14:sizeRelH relativeFrom="margin">
+                <wp14:pctWidth>0</wp14:pctWidth>
+              </wp14:sizeRelH>
+              <wp14:sizeRelV relativeFrom="margin">
+                <wp14:pctHeight>0</wp14:pctHeight>
+              </wp14:sizeRelV>
+            </wp:anchor>
+          </w:drawing>
+        </mc:Choice>
+        <mc:Fallback>
+          <w:pict>
+            <v:shapetype w14:anchorId="57ABE7DB" id="_x0000_t202" coordsize="21600,21600" o:spt="202" path="m,l,21600r21600,l21600,xe">
+              <v:stroke joinstyle="miter"/>
+              <v:path gradientshapeok="t" o:connecttype="rect"/>
+            </v:shapetype>
+            <v:shape id="Cuadro de texto 4" o:spid="_x0000_s1026" type="#_x0000_t202" style="position:absolute;margin-left:215.65pt;margin-top:7.15pt;width:154.8pt;height:38.4pt;z-index:251664384;visibility:visible;mso-wrap-style:square;mso-width-percent:0;mso-height-percent:0;mso-wrap-distance-left:9pt;mso-wrap-distance-top:0;mso-wrap-distance-right:9pt;mso-wrap-distance-bottom:0;mso-position-horizontal:absolute;mso-position-horizontal-relative:text;mso-position-vertical:absolute;mso-position-vertical-relative:text;mso-width-percent:0;mso-height-percent:0;mso-width-relative:margin;mso-height-relative:margin;v-text-anchor:top" o:gfxdata="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" filled="f" stroked="f" strokeweight=".5pt">
+              <v:textbox>
+                <w:txbxContent>
+                  <w:p>
+                    <w:pPr>
+                      <w:spacing w:after="0" w:line="240" w:lineRule="auto"/>
+                      <w:jc w:val="right"/>
+                      <w:rPr>
+                        <w:sz w:val="18"/>
+                        <w:szCs w:val="18"/>
+                      </w:rPr>
+                    </w:pPr>
+                    <w:r>
+                      <w:rPr>
+                        <w:sz w:val="18"/>
+                        <w:szCs w:val="18"/>
+                      </w:rPr>
+                      <w:t>CONSULTOR: NOE MORA RAMIREZ</w:t>
+                    </w:r>
+                  </w:p>
+                  <w:p>
+                    <w:pPr>
+                      <w:spacing w:after="0" w:line="240" w:lineRule="auto"/>
+                      <w:jc w:val="right"/>
+                      <w:rPr>
+                        <w:sz w:val="18"/>
+                        <w:szCs w:val="18"/>
+                      </w:rPr>
+                    </w:pPr>
+                    <w:r>
+                      <w:rPr>
+                        <w:sz w:val="18"/>
+                        <w:szCs w:val="18"/>
+                      </w:rPr>
+                      <w:t>TELEFONO CELULAR: 2454504055</w:t>
+                    </w:r>
+                  </w:p>
+                  <w:p>
+                    <w:pPr>
+                      <w:spacing w:after="0" w:line="240" w:lineRule="auto"/>
+                      <w:jc w:val="right"/>
+                      <w:rPr>
+                        <w:sz w:val="18"/>
+                        <w:szCs w:val="18"/>
+                      </w:rPr>
+                    </w:pPr>
+                    <w:r>
+                      <w:rPr>
+                        <w:sz w:val="18"/>
+                        <w:szCs w:val="18"/>
+                      </w:rPr>
+                      <w:t>CORREO: halcon_noe@yahoo.com.mx</w:t>
+                    </w:r>
+                  </w:p>
+                </w:txbxContent>
+              </v:textbox>
+            </v:shape>
+          </w:pict>
+        </mc:Fallback>
+      </mc:AlternateContent>
+    </w:r>
+    <w:r>
+      <w:rPr>
         <w:color w:val="8496B0" w:themeColor="text2" w:themeTint="99"/>
         <w:spacing w:val="60"/>
       </w:rPr>
@@ -2811,7 +3130,7 @@
       <w:rPr>
         <w:color w:val="323E4F" w:themeColor="text2" w:themeShade="BF"/>
       </w:rPr>
-      <w:t>4</w:t>
+      <w:t>1</w:t>
     </w:r>
     <w:r>
       <w:rPr>
@@ -2847,7 +3166,7 @@
       <w:rPr>
         <w:color w:val="323E4F" w:themeColor="text2" w:themeShade="BF"/>
       </w:rPr>
-      <w:t>179</w:t>
+      <w:t>185</w:t>
     </w:r>
     <w:r>
       <w:rPr>
@@ -2855,6 +3174,11 @@
       </w:rPr>
       <w:fldChar w:fldCharType="end"/>
     </w:r>
+  </w:p>
+  <w:p>
+    <w:pPr>
+      <w:pStyle w:val="Piedepgina"/>
+    </w:pPr>
   </w:p>
   <w:p>
     <w:pPr>

</xml_diff>